<commit_message>
docs: add team member names (Rakhat, Danas, Nurlan)
Co-Authored-By: Claude Opus 5.5 <noreply@anthropic.com>
</commit_message>
<xml_diff>
--- a/deliverables/Project_Activity_1_Report.docx
+++ b/deliverables/Project_Activity_1_Report.docx
@@ -52,7 +52,7 @@
         <w:t xml:space="preserve">Team members: </w:t>
       </w:r>
       <w:r>
-        <w:t>Student 1, Student 2, Student 3</w:t>
+        <w:t>Rakhat, Danas, Nurlan</w:t>
       </w:r>
     </w:p>
     <w:p>
@@ -442,7 +442,7 @@
           </w:tcPr>
           <w:p>
             <w:r>
-              <w:t>Student 1</w:t>
+              <w:t>Rakhat</w:t>
             </w:r>
           </w:p>
         </w:tc>
@@ -464,7 +464,7 @@
           </w:tcPr>
           <w:p>
             <w:r>
-              <w:t>Student 2</w:t>
+              <w:t>Danas</w:t>
             </w:r>
           </w:p>
         </w:tc>
@@ -486,7 +486,7 @@
           </w:tcPr>
           <w:p>
             <w:r>
-              <w:t>Student 3</w:t>
+              <w:t>Nurlan</w:t>
             </w:r>
           </w:p>
         </w:tc>
@@ -524,7 +524,7 @@
         <w:rPr>
           <w:b/>
         </w:rPr>
-        <w:t xml:space="preserve">Student 1 (API): </w:t>
+        <w:t xml:space="preserve">Rakhat (API): </w:t>
       </w:r>
       <w:r>
         <w:t>API tests with the Flask test client — e.g. TC-02 POST /tasks returns 201 and status “todo”; TC-03/04 invalid input returns 400; TC-08/11 unknown id returns 404; TC-09 PATCH changes status to “done”. Success = all API tests green.</w:t>
@@ -538,7 +538,7 @@
         <w:rPr>
           <w:b/>
         </w:rPr>
-        <w:t xml:space="preserve">Student 2 (Storage / QA): </w:t>
+        <w:t xml:space="preserve">Danas (Storage / QA): </w:t>
       </w:r>
       <w:r>
         <w:t>Unit tests on a temporary database — TC-13 data survives re-opening the DB file (simulates a container restart); TC-14 unknown fields are ignored on update; TC-15 missing task returns None/False. Success = tests green and coverage ≥ 80 % (actual 97 %).</w:t>
@@ -552,7 +552,7 @@
         <w:rPr>
           <w:b/>
         </w:rPr>
-        <w:t xml:space="preserve">Student 3 (DevOps): </w:t>
+        <w:t xml:space="preserve">Nurlan (DevOps): </w:t>
       </w:r>
       <w:r>
         <w:t>Infrastructure checks — TC-D1 docker build fails if a test fails (tests run in the build stage); TC-D2 container becomes “healthy”; TC-D3 tasks remain after docker compose down/up; TC-D4 container runs as non-root user; TC-D5 CI smoke test creates a task through curl. Success = green GitHub Actions run.</w:t>
@@ -787,7 +787,7 @@
           </w:tcPr>
           <w:p>
             <w:r>
-              <w:t>Student 1</w:t>
+              <w:t>Rakhat</w:t>
             </w:r>
           </w:p>
         </w:tc>
@@ -819,7 +819,7 @@
           </w:tcPr>
           <w:p>
             <w:r>
-              <w:t>Student 2</w:t>
+              <w:t>Danas</w:t>
             </w:r>
           </w:p>
         </w:tc>
@@ -851,7 +851,7 @@
           </w:tcPr>
           <w:p>
             <w:r>
-              <w:t>Student 3</w:t>
+              <w:t>Nurlan</w:t>
             </w:r>
           </w:p>
         </w:tc>
@@ -897,7 +897,7 @@
         <w:rPr>
           <w:b/>
         </w:rPr>
-        <w:t xml:space="preserve">Student 1 – code: </w:t>
+        <w:t xml:space="preserve">Rakhat – code: </w:t>
       </w:r>
       <w:r>
         <w:t>REST endpoints GET/POST /tasks, GET/PATCH/DELETE /tasks/&lt;id&gt;, GET /stats, GET /health, JSON validation and JSON error responses. Expected result: API answers with correct codes 200/201/204/400/404.</w:t>
@@ -911,7 +911,7 @@
         <w:rPr>
           <w:b/>
         </w:rPr>
-        <w:t xml:space="preserve">Student 2 – code + documents: </w:t>
+        <w:t xml:space="preserve">Danas – code + documents: </w:t>
       </w:r>
       <w:r>
         <w:t>SQLite repository (create, get, list, update, delete, stats), test plan with 15 test cases and their automation. Expected result: data is stored safely and every feature is covered by tests.</w:t>
@@ -925,7 +925,7 @@
         <w:rPr>
           <w:b/>
         </w:rPr>
-        <w:t xml:space="preserve">Student 3 – code + documents: </w:t>
+        <w:t xml:space="preserve">Nurlan – code + documents: </w:t>
       </w:r>
       <w:r>
         <w:t>Dockerfile, docker-compose.yml, CI workflow, run instructions in README. Expected result: one command starts the app; every push is checked automatically.</w:t>

</xml_diff>